<commit_message>
vault backup: 2026-09-28 17:24:58
</commit_message>
<xml_diff>
--- a/ComitoDaniel_PF825.docx
+++ b/ComitoDaniel_PF825.docx
@@ -2045,7 +2045,7 @@
           <w:sz w:val="20"/>
           <w:szCs w:val="20"/>
         </w:rPr>
-        <w:t>NCL Codebreaker Participant</w:t>
+        <w:t>NCL Participant</w:t>
       </w:r>
       <w:r>
         <w:rPr>
@@ -2090,7 +2090,7 @@
           <w:sz w:val="20"/>
           <w:szCs w:val="20"/>
         </w:rPr>
-        <w:t>NCL results are linked in the attachments section of application</w:t>
+        <w:t>Scored fairly for a freshman</w:t>
       </w:r>
     </w:p>
     <w:p>
@@ -5923,6 +5923,26 @@
 </file>
 
 <file path=customXml/item1.xml><?xml version="1.0" encoding="utf-8"?>
+<?mso-contentType ?>
+<FormTemplates xmlns="http://schemas.microsoft.com/sharepoint/v3/contenttype/forms">
+  <Display>DocumentLibraryForm</Display>
+  <Edit>DocumentLibraryForm</Edit>
+  <New>DocumentLibraryForm</New>
+</FormTemplates>
+</file>
+
+<file path=customXml/item2.xml><?xml version="1.0" encoding="utf-8"?>
+<p:properties xmlns:p="http://schemas.microsoft.com/office/2006/metadata/properties" xmlns:xsi="http://www.w3.org/2001/XMLSchema-instance" xmlns:pc="http://schemas.microsoft.com/office/infopath/2007/PartnerControls">
+  <documentManagement>
+    <TaxCatchAll xmlns="7bb6569b-d7bd-46ec-99b0-893c50fe7eec" xsi:nil="true"/>
+    <lcf76f155ced4ddcb4097134ff3c332f xmlns="88190ddc-c3bc-488f-b2ac-300a9979aacf">
+      <Terms xmlns="http://schemas.microsoft.com/office/infopath/2007/PartnerControls"/>
+    </lcf76f155ced4ddcb4097134ff3c332f>
+  </documentManagement>
+</p:properties>
+</file>
+
+<file path=customXml/item3.xml><?xml version="1.0" encoding="utf-8"?>
 <ct:contentTypeSchema xmlns:ct="http://schemas.microsoft.com/office/2006/metadata/contentType" xmlns:ma="http://schemas.microsoft.com/office/2006/metadata/properties/metaAttributes" ct:_="" ma:_="" ma:contentTypeName="Document" ma:contentTypeID="0x0101007190CEECE145C84E9B9614A531FD5BD5" ma:contentTypeVersion="19" ma:contentTypeDescription="Create a new document." ma:contentTypeScope="" ma:versionID="53e06a096233825ad6a3a71c87b6f7a0">
   <xsd:schema xmlns:xsd="http://www.w3.org/2001/XMLSchema" xmlns:xs="http://www.w3.org/2001/XMLSchema" xmlns:p="http://schemas.microsoft.com/office/2006/metadata/properties" xmlns:ns2="88190ddc-c3bc-488f-b2ac-300a9979aacf" xmlns:ns3="7bb6569b-d7bd-46ec-99b0-893c50fe7eec" targetNamespace="http://schemas.microsoft.com/office/2006/metadata/properties" ma:root="true" ma:fieldsID="6d81c8cde934dfd5ce5ff467b76ba34e" ns2:_="" ns3:_="">
     <xsd:import namespace="88190ddc-c3bc-488f-b2ac-300a9979aacf"/>
@@ -6183,27 +6203,26 @@
 </ct:contentTypeSchema>
 </file>
 
-<file path=customXml/item2.xml><?xml version="1.0" encoding="utf-8"?>
-<p:properties xmlns:p="http://schemas.microsoft.com/office/2006/metadata/properties" xmlns:xsi="http://www.w3.org/2001/XMLSchema-instance" xmlns:pc="http://schemas.microsoft.com/office/infopath/2007/PartnerControls">
-  <documentManagement>
-    <TaxCatchAll xmlns="7bb6569b-d7bd-46ec-99b0-893c50fe7eec" xsi:nil="true"/>
-    <lcf76f155ced4ddcb4097134ff3c332f xmlns="88190ddc-c3bc-488f-b2ac-300a9979aacf">
-      <Terms xmlns="http://schemas.microsoft.com/office/infopath/2007/PartnerControls"/>
-    </lcf76f155ced4ddcb4097134ff3c332f>
-  </documentManagement>
-</p:properties>
+<file path=customXml/itemProps1.xml><?xml version="1.0" encoding="utf-8"?>
+<ds:datastoreItem xmlns:ds="http://schemas.openxmlformats.org/officeDocument/2006/customXml" ds:itemID="{D15A20F1-E77F-4337-BE6F-9FF384A9B950}">
+  <ds:schemaRefs>
+    <ds:schemaRef ds:uri="http://schemas.microsoft.com/sharepoint/v3/contenttype/forms"/>
+  </ds:schemaRefs>
+</ds:datastoreItem>
 </file>
 
-<file path=customXml/item3.xml><?xml version="1.0" encoding="utf-8"?>
-<?mso-contentType ?>
-<FormTemplates xmlns="http://schemas.microsoft.com/sharepoint/v3/contenttype/forms">
-  <Display>DocumentLibraryForm</Display>
-  <Edit>DocumentLibraryForm</Edit>
-  <New>DocumentLibraryForm</New>
-</FormTemplates>
+<file path=customXml/itemProps2.xml><?xml version="1.0" encoding="utf-8"?>
+<ds:datastoreItem xmlns:ds="http://schemas.openxmlformats.org/officeDocument/2006/customXml" ds:itemID="{13D25599-A281-4E68-8243-67203488F6B0}">
+  <ds:schemaRefs>
+    <ds:schemaRef ds:uri="http://schemas.microsoft.com/office/2006/metadata/properties"/>
+    <ds:schemaRef ds:uri="http://schemas.microsoft.com/office/infopath/2007/PartnerControls"/>
+    <ds:schemaRef ds:uri="7bb6569b-d7bd-46ec-99b0-893c50fe7eec"/>
+    <ds:schemaRef ds:uri="88190ddc-c3bc-488f-b2ac-300a9979aacf"/>
+  </ds:schemaRefs>
+</ds:datastoreItem>
 </file>
 
-<file path=customXml/itemProps1.xml><?xml version="1.0" encoding="utf-8"?>
+<file path=customXml/itemProps3.xml><?xml version="1.0" encoding="utf-8"?>
 <ds:datastoreItem xmlns:ds="http://schemas.openxmlformats.org/officeDocument/2006/customXml" ds:itemID="{5B6C1A3A-714E-469F-98B8-75603E56ECA5}">
   <ds:schemaRefs>
     <ds:schemaRef ds:uri="http://schemas.microsoft.com/office/2006/metadata/contentType"/>
@@ -6220,23 +6239,4 @@
     <ds:schemaRef ds:uri="http://schemas.microsoft.com/internal/obd"/>
   </ds:schemaRefs>
 </ds:datastoreItem>
-</file>
-
-<file path=customXml/itemProps2.xml><?xml version="1.0" encoding="utf-8"?>
-<ds:datastoreItem xmlns:ds="http://schemas.openxmlformats.org/officeDocument/2006/customXml" ds:itemID="{13D25599-A281-4E68-8243-67203488F6B0}">
-  <ds:schemaRefs>
-    <ds:schemaRef ds:uri="http://schemas.microsoft.com/office/2006/metadata/properties"/>
-    <ds:schemaRef ds:uri="http://schemas.microsoft.com/office/infopath/2007/PartnerControls"/>
-    <ds:schemaRef ds:uri="7bb6569b-d7bd-46ec-99b0-893c50fe7eec"/>
-    <ds:schemaRef ds:uri="88190ddc-c3bc-488f-b2ac-300a9979aacf"/>
-  </ds:schemaRefs>
-</ds:datastoreItem>
-</file>
-
-<file path=customXml/itemProps3.xml><?xml version="1.0" encoding="utf-8"?>
-<ds:datastoreItem xmlns:ds="http://schemas.openxmlformats.org/officeDocument/2006/customXml" ds:itemID="{D15A20F1-E77F-4337-BE6F-9FF384A9B950}">
-  <ds:schemaRefs>
-    <ds:schemaRef ds:uri="http://schemas.microsoft.com/sharepoint/v3/contenttype/forms"/>
-  </ds:schemaRefs>
-</ds:datastoreItem>
 </file>
</xml_diff>